<commit_message>
Remove Schedule A — Authority Reference Matrix heading and stub text (matrix was never populated; heading and non-operative intro text removed; §15.3 references to Schedule A if any remain in operative text are now void)
</commit_message>
<xml_diff>
--- a/constitution-v144.docx
+++ b/constitution-v144.docx
@@ -14982,45 +14982,6 @@
           <w:szCs w:val="22"/>
         </w:rPr>
         <w:t xml:space="preserve">The compact must specify with particularity: the services the Republic provides to the Associated Community; any reciprocal obligations, financial contributions, access rights, or other benefits the Associated Community provides to the Republic; and where the compact provides no reciprocal contribution from the Associated Community, a published statement of the Republic's non-economic interest justifying the arrangement. Reciprocal obligations must be material at the time of ratification. Where either party takes regulatory action that materially reduces the value of a reciprocal obligation, the other party may invoke the compact review mechanism immediately. The Monetary Authority certifies whether a regulatory action has materially reduced a reciprocal obligation's value within 60 days of formal request. The compact must specify a review mechanism not less frequent than every ten years at which both parties may propose renegotiation of fiscal terms. Review creates a good-faith negotiation obligation; it does not automatically terminate the compact.</w:t>
-      </w:r>
-    </w:p>
-    <w:p>
-      <w:pPr>
-        <w:pBdr>
-          <w:bottom w:val="single" w:color="C9A84C" w:sz="6" w:space="6"/>
-        </w:pBdr>
-        <w:spacing w:after="200" w:before="0"/>
-        <w:jc w:val="center"/>
-      </w:pPr>
-      <w:r>
-        <w:br w:type="page"/>
-      </w:r>
-      <w:r>
-        <w:rPr>
-          <w:rFonts w:ascii="Times New Roman" w:cs="Times New Roman" w:eastAsia="Times New Roman" w:hAnsi="Times New Roman"/>
-          <w:b/>
-          <w:bCs/>
-          <w:color w:val="1B2A4A"/>
-          <w:spacing w:val="20"/>
-          <w:sz w:val="28"/>
-          <w:szCs w:val="28"/>
-        </w:rPr>
-        <w:t xml:space="preserve">SCHEDULE A — AUTHORITY REFERENCE MATRIX</w:t>
-      </w:r>
-    </w:p>
-    <w:p>
-      <w:pPr>
-        <w:spacing w:after="60" w:before="60" w:line="280" w:lineRule="auto"/>
-        <w:jc w:val="both"/>
-      </w:pPr>
-      <w:r>
-        <w:rPr>
-          <w:rFonts w:ascii="Times New Roman" w:cs="Times New Roman" w:eastAsia="Times New Roman" w:hAnsi="Times New Roman"/>
-          <w:color w:val="000000"/>
-          <w:sz w:val="22"/>
-          <w:szCs w:val="22"/>
-        </w:rPr>
-        <w:t xml:space="preserve">This Schedule is a non-operative reference guide summarizing key constitutional provisions, authority allocations, and procedural rules. It is provided for navigational clarity and citizen accessibility. In the event of any inconsistency between this Schedule and the operative text of Articles I through XIX, the operative text prevails. This Schedule has no independent legal effect and may be revised by the Legislative Inspectorate to reflect constitutional amendments without the amendment process applying to the Schedule itself.</w:t>
       </w:r>
     </w:p>
     <w:sectPr>

</xml_diff>

<commit_message>
Article-by-article review corrections: §3.1.e heading updated (Dissolution → Caretaker Activation), cremain typo fixed, stale election bar reference removed; §7.2.b presidential formula numerical example removed from operative text; §7.3.c and 4 other locations — systemic Inspectorate.7 footnote artifact removed document-wide; §8.1.b §12.5.c stale reference → §12.5; §10.5.a stale §10.6 cross-reference removed from compensation clause; §13.5 stub section removed (2 paragraphs); §16.2.a Electoral Commission Removal repositioned before §16.3; §17.4.g NTA disclosure mechanics trimmed. All changes in working document, website update pending.
</commit_message>
<xml_diff>
--- a/constitution-v144.docx
+++ b/constitution-v144.docx
@@ -1211,7 +1211,7 @@
           <w:sz w:val="22"/>
           <w:szCs w:val="22"/>
         </w:rPr>
-        <w:t xml:space="preserve">Any accused person has the right to full disclosure of all State evidence, including exculpatory evidence, before trial. Willful withholding of exculpatory evidence is grounds for immediate dismissal of the case and is reported to the National Record System by the relevant Inspectorate.7.</w:t>
+        <w:t>Any accused person has the right to full disclosure of all State evidence, including exculpatory evidence, before trial. Willful withholding of exculpatory evidence is grounds for immediate dismissal of the case and is reported to the National Record System by the relevant Inspectorate.</w:t>
       </w:r>
     </w:p>
     <w:p>
@@ -1308,7 +1308,7 @@
           <w:sz w:val="22"/>
           <w:szCs w:val="22"/>
         </w:rPr>
-        <w:t xml:space="preserve">The right to trial may not be penalised through enhanced sentencing or prosecutorial retaliation. the Legislature must by statute define specific protections against charging decisions and sentencing recommendations made solely on the basis of a defendant's exercise of the right to trial. Violation of statutory protections under this provision is grounds for case dismissal or sentence reduction at the court's discretion and is reported to the National Record System by the relevant Inspectorate.7 against responsible officials. This obligation is self-executing: in the absence of a statute, no prosecutorial decision regarding charges, no plea offer, and no sentencing determination may reference, directly or indirectly, a defendant's exercise of their right to trial as a factor. Any evidence that the exercise of the trial right was treated as a negative factor in charging or sentencing constitutes a constitutional violation remediable by the court on application.</w:t>
+        <w:t>The right to trial may not be penalised through enhanced sentencing or prosecutorial retaliation. the Legislature must by statute define specific protections against charging decisions and sentencing recommendations made solely on the basis of a defendant's exercise of the right to trial. Violation of statutory protections under this provision is grounds for case dismissal or sentence reduction at the court's discretion and is reported to the National Record System by the relevant Inspectorate against responsible officials. This obligation is self-executing: in the absence of a statute, no prosecutorial decision regarding charges, no plea offer, and no sentencing determination may reference, directly or indirectly, a defendant's exercise of their right to trial as a factor. Any evidence that the exercise of the trial right was treated as a negative factor in charging or sentencing constitutes a constitutional violation remediable by the court on application.</w:t>
       </w:r>
     </w:p>
     <w:p>
@@ -3504,16 +3504,16 @@
           <w:sz w:val="22"/>
           <w:szCs w:val="22"/>
         </w:rPr>
-        <w:t xml:space="preserve">3.1.e Dissolution and Emergency Elections: </w:t>
-      </w:r>
-      <w:r>
-        <w:rPr>
-          <w:rFonts w:ascii="Times New Roman" w:cs="Times New Roman" w:eastAsia="Times New Roman" w:hAnsi="Times New Roman"/>
-          <w:color w:val="000000"/>
-          <w:sz w:val="22"/>
-          <w:szCs w:val="22"/>
-        </w:rPr>
-        <w:t xml:space="preserve">Failure to seat a PM within the statutory period defined under §2.3.a activates the Caretaker Protocol under §2.3.c. Members who were present and voting during the statutory selection period are subject to the election bar described in §2.3.a, subject to the good-faith participation exemption of that section. The Senate Speaker cremain in office and continue trying to seat a PM as provided in §2.3.a.</w:t>
+        <w:t xml:space="preserve">3.1.e Caretaker Activation and PM Formation: </w:t>
+      </w:r>
+      <w:r>
+        <w:rPr>
+          <w:rFonts w:ascii="Times New Roman" w:cs="Times New Roman" w:eastAsia="Times New Roman" w:hAnsi="Times New Roman"/>
+          <w:color w:val="000000"/>
+          <w:sz w:val="22"/>
+          <w:szCs w:val="22"/>
+        </w:rPr>
+        <w:t>Failure to seat a PM within the statutory period defined under §2.3.a activates the Caretaker Protocol under §2.3.c. The House continues in session and retains the ability to seat a PM at any time. The LI publishes weekly accountability reports naming each member's participation record, as provided in §2.3.a.</w:t>
       </w:r>
     </w:p>
     <w:p>
@@ -4080,7 +4080,7 @@
           <w:sz w:val="22"/>
           <w:szCs w:val="22"/>
         </w:rPr>
-        <w:t xml:space="preserve">The following data may not be used at any stage of the district-drawing process: partisan registration data; voting history data; incumbent or candidate residence; and racial or ethnic composition as a primary consideration. Use of prohibited inputs by any person or body involved in district drawing is reported to the National Record System by the relevant Inspectorate.7.</w:t>
+        <w:t>The following data may not be used at any stage of the district-drawing process: partisan registration data; voting history data; incumbent or candidate residence; and racial or ethnic composition as a primary consideration. Use of prohibited inputs by any person or body involved in district drawing is reported to the National Record System by the relevant Inspectorate.</w:t>
       </w:r>
     </w:p>
     <w:p>
@@ -6663,7 +6663,7 @@
           <w:sz w:val="22"/>
           <w:szCs w:val="22"/>
         </w:rPr>
-        <w:t xml:space="preserve">Where no candidate achieves a national RCV majority, the winner is the candidate with the highest combined score: 65% weight applied to the candidate's share of the national first-preference vote, plus 35% weight applied to the fraction of the Republic's presidential election regions — as defined by the Legislature under §7.2.c — in which the candidate placed first among all candidates. A candidate who places first in all regions scores the full 35% regional component; a candidate who places first in zero regions scores zero. The regional fraction is the number of regions won divided by the total number of regions the Legislature has defined. As an example using five regions: a candidate who receives 60% of national first-preference votes and wins 3 of 5 regions would score (0.65 × 0.60) + (0.35 × 3/5) = 0.39 + 0.21 = 0.60, comfortably winning.</w:t>
+        <w:t>Where no candidate achieves a national RCV majority, the winner is the candidate with the highest combined score: 65% weight applied to the candidate's share of the national first-preference vote, plus 35% weight applied to the fraction of the Republic's presidential election regions — as defined by the Legislature under §7.2.c — in which the candidate placed first among all candidates. A candidate who places first in all regions scores the full 35% regional component; a candidate who places first in zero regions scores zero. The regional fraction is the number of regions won divided by the total number of regions the Legislature has defined.</w:t>
       </w:r>
     </w:p>
     <w:p>
@@ -6864,7 +6864,7 @@
           <w:sz w:val="22"/>
           <w:szCs w:val="22"/>
         </w:rPr>
-        <w:t xml:space="preserve">No State may take any action that reduces National Voting System access, functionality, or processing capacity in its jurisdiction. The Electoral Commission monitors participation rates and reports statistically significant reductions to the Legislative Inspectorate. A confirmed pattern of reduced accessibility is reported to the National Record System by the relevant Inspectorate.7 for the relevant State officials.</w:t>
+        <w:t>No State may take any action that reduces National Voting System access, functionality, or processing capacity in its jurisdiction. The Electoral Commission monitors participation rates and reports statistically significant reductions to the Legislative Inspectorate. A confirmed pattern of reduced accessibility is reported to the National Record System by the relevant Inspectorate for the relevant State officials.</w:t>
       </w:r>
     </w:p>
     <w:p>
@@ -6974,7 +6974,7 @@
           <w:sz w:val="22"/>
           <w:szCs w:val="22"/>
         </w:rPr>
-        <w:t xml:space="preserve">Audits both executive offices and the Monetary Authority for constitutional compliance — including NRS mandate adherence, domain boundary compliance, classification rules, ethics provisions, public defense resourcing (§1.14.b), Treaty Emergency Certification expenditures (§12.5.c), and the National Endowment where established by statute.  The Executive Inspectorate publishes a factual background report on any clemency petition under §2.1.g or §2.2.f before the relevant executive acts. The report covers the petitioner's record, the conviction, and any relevant prior EI findings, and is published to the NRS simultaneously with delivery to the executive. For candidate assessment functions, the EI reviews candidate disclosure records submitted by nominating actors, applies constitutional eligibility criteria, and publishes the submitted record together with its recommendation to the NRS — it does not generate independent assessments. Military Constitutional Compliance: The Executive Inspectorate's annual audit of the presidential office includes a specific assessment of military constitutional compliance: whether military operations during the year were authorized through the Tier framework of §2.1; whether Intelligence Firewall compliance under §12.3 was maintained with no domestic surveillance of Republic citizens; and whether fund certification requirements under §2.1.d were followed for all military expenditures. The EI publishes its military constitutional compliance findings as a dedicated section of its Annual State of the Republic Report.</w:t>
+        <w:t>Audits both executive offices and the Monetary Authority for constitutional compliance — including NRS mandate adherence, domain boundary compliance, classification rules, ethics provisions, public defense resourcing (§1.14.b), Treaty Emergency Certification expenditures (§12.5), and the National Endowment where established by statute.  The Executive Inspectorate publishes a factual background report on any clemency petition under §2.1.g or §2.2.f before the relevant executive acts. The report covers the petitioner's record, the conviction, and any relevant prior EI findings, and is published to the NRS simultaneously with delivery to the executive. For candidate assessment functions, the EI reviews candidate disclosure records submitted by nominating actors, applies constitutional eligibility criteria, and publishes the submitted record together with its recommendation to the NRS — it does not generate independent assessments. Military Constitutional Compliance: The Executive Inspectorate's annual audit of the presidential office includes a specific assessment of military constitutional compliance: whether military operations during the year were authorized through the Tier framework of §2.1; whether Intelligence Firewall compliance under §12.3 was maintained with no domestic surveillance of Republic citizens; and whether fund certification requirements under §2.1.d were followed for all military expenditures. The EI publishes its military constitutional compliance findings as a dedicated section of its Annual State of the Republic Report.</w:t>
       </w:r>
     </w:p>
     <w:p>
@@ -9285,7 +9285,7 @@
           <w:sz w:val="22"/>
           <w:szCs w:val="22"/>
         </w:rPr>
-        <w:t xml:space="preserve">The standard for all official benefits, allowances, and limitations is that of a civil service employee in a comparable role. Departure from this standard is permitted only where an official's constitutional responsibilities create a demonstrable operational need, and only to the minimum extent that need requires. This standard covers: housing in session — standardized, no luxury stipends; healthcare and retirement — the same systems as the citizens officials serve; and compensation, defined by House statute under §10.6.</w:t>
+        <w:t>The standard for all official benefits, allowances, and limitations is that of a civil service employee in a comparable role. Departure from this standard is permitted only where an official's constitutional responsibilities create a demonstrable operational need, and only to the minimum extent that need requires. This standard covers: housing in session — standardized, no luxury stipends; healthcare and retirement — the same systems as the citizens officials serve; and compensation, defined by House statute.</w:t>
       </w:r>
     </w:p>
     <w:p>
@@ -10809,51 +10809,6 @@
           <w:sz w:val="23"/>
           <w:szCs w:val="23"/>
         </w:rPr>
-        <w:t xml:space="preserve">Section 13.5 — Associated Community Cross-Reference</w:t>
-      </w:r>
-    </w:p>
-    <w:p>
-      <w:pPr>
-        <w:spacing w:after="60" w:before="60" w:line="280" w:lineRule="auto"/>
-        <w:jc w:val="both"/>
-      </w:pPr>
-      <w:r>
-        <w:rPr>
-          <w:rFonts w:ascii="Times New Roman" w:cs="Times New Roman" w:eastAsia="Times New Roman" w:hAnsi="Times New Roman"/>
-          <w:b/>
-          <w:bCs/>
-          <w:color w:val="1B2A4A"/>
-          <w:sz w:val="22"/>
-          <w:szCs w:val="22"/>
-        </w:rPr>
-        <w:t xml:space="preserve">13.5 Associated Community Relationships: </w:t>
-      </w:r>
-      <w:r>
-        <w:rPr>
-          <w:rFonts w:ascii="Times New Roman" w:cs="Times New Roman" w:eastAsia="Times New Roman" w:hAnsi="Times New Roman"/>
-          <w:color w:val="000000"/>
-          <w:sz w:val="22"/>
-          <w:szCs w:val="22"/>
-        </w:rPr>
-        <w:t xml:space="preserve">Associated Community status — the constitutional framework governing compact relationships between the Republic and sovereign entities — is established in Article XX of this Constitution. §13.5 is reserved for the Article XX cross-reference. See Article XX for all provisions governing the establishment, terms, conditions, and termination of Associated Community compacts.</w:t>
-      </w:r>
-    </w:p>
-    <w:p>
-      <w:pPr>
-        <w:pBdr>
-          <w:bottom w:val="single" w:color="7A7060" w:sz="2" w:space="4"/>
-        </w:pBdr>
-        <w:spacing w:after="60" w:before="280"/>
-      </w:pPr>
-      <w:r>
-        <w:rPr>
-          <w:rFonts w:ascii="Times New Roman" w:cs="Times New Roman" w:eastAsia="Times New Roman" w:hAnsi="Times New Roman"/>
-          <w:b/>
-          <w:bCs/>
-          <w:color w:val="1B2A4A"/>
-          <w:sz w:val="23"/>
-          <w:szCs w:val="23"/>
-        </w:rPr>
         <w:t xml:space="preserve">Section 13.6 — Voluntary Incorporation</w:t>
       </w:r>
     </w:p>
@@ -12198,6 +12153,32 @@
     </w:p>
     <w:p>
       <w:pPr>
+        <w:spacing w:after="60" w:before="60" w:line="280" w:lineRule="auto"/>
+        <w:jc w:val="both"/>
+      </w:pPr>
+      <w:r>
+        <w:rPr>
+          <w:rFonts w:ascii="Times New Roman" w:cs="Times New Roman" w:eastAsia="Times New Roman" w:hAnsi="Times New Roman"/>
+          <w:b/>
+          <w:bCs/>
+          <w:color w:val="1B2A4A"/>
+          <w:sz w:val="22"/>
+          <w:szCs w:val="22"/>
+        </w:rPr>
+        <w:t xml:space="preserve">16.2.a Electoral Commission Removal: </w:t>
+      </w:r>
+      <w:r>
+        <w:rPr>
+          <w:rFonts w:ascii="Times New Roman" w:cs="Times New Roman" w:eastAsia="Times New Roman" w:hAnsi="Times New Roman"/>
+          <w:color w:val="000000"/>
+          <w:sz w:val="22"/>
+          <w:szCs w:val="22"/>
+        </w:rPr>
+        <w:t xml:space="preserve">Electoral Commission members may be removed only through For-Cause proceedings. No-Cause removal is not available — the Electoral Commission administers all national elections and referenda; a no-cause removal mechanism would create an unacceptable vector for electoral manipulation by any temporary legislative majority. For-Cause Removal Grounds: documented dereliction of duty, incapacity to perform the functions of the office, undisclosed conflict of interest, criminal conviction, or conduct that materially compromises the integrity of any election or referendum. Process: The Judicial Inspectorate — which audits the Electoral Commission annually under §8.1.c — must publish a documented finding of specific misconduct to the National Record System before any removal vote may proceed. The finding is published no later than 30 days after a removal motion is filed. The finding is advisory — it does not compel removal — but no removal vote may be held without it. Following publication of the JI finding, removal requires a 2/3 vote of both chambers simultaneously, calculated against full seated membership of each chamber. A member subject to For-Cause proceedings continues all duties until the removal vote concludes; they may not be suspended from duties pending the JI finding or the legislative vote. Upon removal, the seat is filled through a special election held within 90 days under the same process as a regular Electoral Commission election. The replacement serves a full new non-renewable 6-year term from the date of certification, not the remainder of the removed member's term.</w:t>
+      </w:r>
+    </w:p>
+    <w:p>
+      <w:pPr>
         <w:pBdr>
           <w:bottom w:val="single" w:color="7A7060" w:sz="2" w:space="4"/>
         </w:pBdr>
@@ -12213,32 +12194,6 @@
           <w:szCs w:val="23"/>
         </w:rPr>
         <w:t xml:space="preserve">Section 16.3 — Constitutional Properties of the National Voting System</w:t>
-      </w:r>
-    </w:p>
-    <w:p>
-      <w:pPr>
-        <w:spacing w:after="60" w:before="60" w:line="280" w:lineRule="auto"/>
-        <w:jc w:val="both"/>
-      </w:pPr>
-      <w:r>
-        <w:rPr>
-          <w:rFonts w:ascii="Times New Roman" w:cs="Times New Roman" w:eastAsia="Times New Roman" w:hAnsi="Times New Roman"/>
-          <w:b/>
-          <w:bCs/>
-          <w:color w:val="1B2A4A"/>
-          <w:sz w:val="22"/>
-          <w:szCs w:val="22"/>
-        </w:rPr>
-        <w:t xml:space="preserve">16.2.a Electoral Commission Removal: </w:t>
-      </w:r>
-      <w:r>
-        <w:rPr>
-          <w:rFonts w:ascii="Times New Roman" w:cs="Times New Roman" w:eastAsia="Times New Roman" w:hAnsi="Times New Roman"/>
-          <w:color w:val="000000"/>
-          <w:sz w:val="22"/>
-          <w:szCs w:val="22"/>
-        </w:rPr>
-        <w:t xml:space="preserve">Electoral Commission members may be removed only through For-Cause proceedings. No-Cause removal is not available — the Electoral Commission administers all national elections and referenda; a no-cause removal mechanism would create an unacceptable vector for electoral manipulation by any temporary legislative majority. For-Cause Removal Grounds: documented dereliction of duty, incapacity to perform the functions of the office, undisclosed conflict of interest, criminal conviction, or conduct that materially compromises the integrity of any election or referendum. Process: The Judicial Inspectorate — which audits the Electoral Commission annually under §8.1.c — must publish a documented finding of specific misconduct to the National Record System before any removal vote may proceed. The finding is published no later than 30 days after a removal motion is filed. The finding is advisory — it does not compel removal — but no removal vote may be held without it. Following publication of the JI finding, removal requires a 2/3 vote of both chambers simultaneously, calculated against full seated membership of each chamber. A member subject to For-Cause proceedings continues all duties until the removal vote concludes; they may not be suspended from duties pending the JI finding or the legislative vote. Upon removal, the seat is filled through a special election held within 90 days under the same process as a regular Electoral Commission election. The replacement serves a full new non-renewable 6-year term from the date of certification, not the remainder of the removed member's term.</w:t>
       </w:r>
     </w:p>
     <w:p>
@@ -13325,7 +13280,7 @@
           <w:sz w:val="22"/>
           <w:szCs w:val="22"/>
         </w:rPr>
-        <w:t xml:space="preserve">The National Trust is administered by a National Trust Administrator nominated by the Prime Minister from a Candidate Register. Before any nomination may proceed, the PM must submit a candidate disclosure record to the Executive Inspectorate. The record must include the candidate's professional background, relevant expertise, financial disclosures, and any prior government positions held. The Executive Inspectorate reviews the submitted record for factual accuracy, applies the constitutional eligibility criteria, and publishes the record together with its recommendation — whether the submitted record demonstrates the criteria are met — to the National Record System before the confirming chamber votes. Where the EI identifies a material factual inaccuracy in the submitted record, it publishes a specific discrepancy finding; the nominating authority may submit a corrected record within a Legislature-defined period, which the EI reviews and publishes alongside the original. Both the original and any corrected records remain permanently on the National Record System. Any citizen who identifies a discrepancy in a published candidate record may petition their elected representative — House member or Senator — who may raise the matter through the confirmation process or request an investigation through proper channels. The nomination and confirmation record are published permanently. National Trust Administrator Eligibility: Candidates must meet the following eligibility criteria, which constitute the constitutional floor for the Candidate Register the PM draws from: no currently held elected or appointed government position at any level; no current financial interest in any entity that holds, develops, or seeks to develop National Trust lands, or that derives commercial benefit from activities within National Trust lands; demonstrated expertise in at least one of — ecological stewardship and conservation management, public land management and administration, environmental law, or natural resource governance; and no criminal conviction for conduct committed while holding federal office of federal service. The Legislature may by statute establish additional qualification requirements consistent with this floor. The PM may not nominate a candidate who does not meet this floor, and the EI publishes a finding if a submitted nominee falls below it before the Senate confirmation vote proceeds. The Administrator is confirmed by the Senate and serves a single non-renewable 5-year term. The Legislative Inspectorate audits National Trust management annually against the stewardship obligation of §17.4.b and publishes its findings to the NRS. If the Senate fails to act on a nomination within the period the Legislature defines by statute, the nominee assumes acting status and performs all constitutional functions of the office. The acting officer escalation framework of §2.2.h applies from the date of assumption. Confirmation by the Senate at any time converts acting status to permanent appointment and the full term begins from the date of confirmation. Removal of a permanently confirmed National Trust Administrator requires a 2/3 vote of both chambers simultaneously and a documented finding of dereliction by the Executive Inspectorate published to the National Record System before the legislative vote may proceed. Upon any mid-term vacancy — through death, resignation, or removal — the most senior National Trust administrative staff member designated by the Legislature by statute assumes acting status immediately and the PM must nominate a replacement within 60 days. The acting officer escalation provisions of this section apply from the date of assumption. A replacement confirmed through Senate confirmation serves a full new 5-year non-renewable term from the date of confirmation.</w:t>
+        <w:t>The National Trust is administered by a National Trust Administrator nominated by the Prime Minister from a Candidate Register. Before any nomination may proceed, the PM must submit a candidate disclosure record to the Executive Inspectorate. The record must include the candidate's professional background, relevant expertise, financial disclosures, and any prior government positions held. The Executive Inspectorate reviews the submitted record for factual accuracy, applies the constitutional eligibility criteria, and publishes the record together with its recommendation — whether the submitted record demonstrates the criteria are met — to the National Record System before the confirming chamber votes.</w:t>
       </w:r>
     </w:p>
     <w:p>
@@ -13719,7 +13674,7 @@
           <w:sz w:val="22"/>
           <w:szCs w:val="22"/>
         </w:rPr>
-        <w:t xml:space="preserve">The Campaign Finance Registry is a distinct system from the National Voting System. When making a contribution, a citizen uses their Citizen Voting Credential to verify their eligibility — confirming they are eligible to vote in the relevant jurisdiction. This verification is separate from the act of voting. The contributor also separately registers their real identity with the Campaign Finance Registry directly; the Registry stores real-name records that are distinct from the cryptographic identifiers used by the National Voting System. The Registry holds contributor identity; the NVS holds voting credentials. The two systems are linked only by the contribution transaction, and that link does not reveal any ballot choices. No information in the Campaign Finance Registry may be used to infer, investigate, or analyze any individual's voting behavior or ballot choices. Violation of this separation is reported to the National Record System by the relevant Inspectorate.7.</w:t>
+        <w:t>The Campaign Finance Registry is a distinct system from the National Voting System. When making a contribution, a citizen uses their Citizen Voting Credential to verify their eligibility — confirming they are eligible to vote in the relevant jurisdiction. This verification is separate from the act of voting. The contributor also separately registers their real identity with the Campaign Finance Registry directly; the Registry stores real-name records that are distinct from the cryptographic identifiers used by the National Voting System. The Registry holds contributor identity; the NVS holds voting credentials. The two systems are linked only by the contribution transaction, and that link does not reveal any ballot choices. No information in the Campaign Finance Registry may be used to infer, investigate, or analyze any individual's voting behavior or ballot choices. Violation of this separation is reported to the National Record System by the relevant Inspectorate.</w:t>
       </w:r>
     </w:p>
     <w:p>
@@ -13845,28 +13800,62 @@
     </w:p>
     <w:p>
       <w:pPr>
-        <w:spacing w:after="60" w:before="60" w:line="280" w:lineRule="auto"/>
-        <w:jc w:val="both"/>
-      </w:pPr>
-      <w:r>
-        <w:rPr>
-          <w:rFonts w:ascii="Times New Roman" w:cs="Times New Roman" w:eastAsia="Times New Roman" w:hAnsi="Times New Roman"/>
-          <w:b/>
-          <w:bCs/>
-          <w:color w:val="1B2A4A"/>
-          <w:sz w:val="22"/>
-          <w:szCs w:val="22"/>
-        </w:rPr>
-        <w:t xml:space="preserve">This Constitution is activated upon: </w:t>
-      </w:r>
-      <w:r>
-        <w:rPr>
-          <w:rFonts w:ascii="Times New Roman" w:cs="Times New Roman" w:eastAsia="Times New Roman" w:hAnsi="Times New Roman"/>
-          <w:color w:val="000000"/>
-          <w:sz w:val="22"/>
-          <w:szCs w:val="22"/>
-        </w:rPr>
-        <w:t xml:space="preserve">(1) certification by the interim Electoral Commission that the National Voting System is operational and meets the properties of §16.3; and (2) a national ratification vote conducted through the National Voting System achieving 60% affirmative support with at least 50% participation. Where a ratifying polity maintains existing legal or administrative institutions whose functions partially overlap with constitutional mechanisms, the Legislature shall by statute within two years of Phase 4 activation define the relationship between such institutions and the constitutional framework. Such statutes must preserve constitutional supremacy and the Supreme Court's jurisdiction over all constitutional questions. This provision recognises that the Republic is ratified into polities with histories, legal traditions, and existing institutional relationships — including relationships with peoples and communities whose governance structures predate the ratifying state — and that those inheritances require constitutional specification, not constitutional silence. If the Legislature fails to enact the required institutional accommodation statute within two years of Phase 4 activation, existing institutions and governance arrangements are deemed constitutionally recognised in their current form pending statutory definition. Default recognition preserves institutional structure and authority; it does not authorise any practice that violates Article I. Existing institutions are recognised as structures; practices within them that violate Article I remain unconstitutional regardless of default recognition status. Accommodation statutes enacted under this provision must not reduce the legal standing of governance structures and institutional relationships that predate the ratifying state below their standing under the law in effect immediately prior to Phase 4 activation. This non-diminishment standard applies to all institutional accommodations including relationships with peoples and communities whose governance structures predate the ratifying state. Statutes enacted under this provision defining the relationship between existing institutions and the constitutional framework may be amended only by a 2/3 majority of both chambers. This elevated threshold applies to any amendment that reduces the protections or standing of existing institutional arrangements. Where the Republic is constituted by two or more sovereign nations simultaneously pooling sovereignty through a treaty of union, the transition provisions of this Article apply with the following adaptations: Phase 0 and Phase 1 certification covers all founding sovereigns simultaneously; debt assumption under §19.6 is consolidated across all founding sovereigns' fiscal histories on terms specified in the treaty of union; the Day Zero NRS publication includes the complete governmental records of all founding sovereigns; and each founding sovereign's predecessor government obligations are assumed by the Republic proportionally as the treaty of union specifies. the Legislature must by statute within two years of Phase 4 activation establish the specific procedures for multi-founder constitutional establishment, covering consolidated debt certification, simultaneous Statehood Audit initiation, and the relationship between the treaty of union and the constitutional text where they address the same matter.</w:t>
+        <w:spacing w:before="60" w:after="60" w:line="280" w:lineRule="auto"/>
+        <w:jc w:val="both"/>
+      </w:pPr>
+      <w:r>
+        <w:rPr>
+          <w:b/>
+          <w:sz w:val="22"/>
+          <w:color w:val="1B2A4A"/>
+        </w:rPr>
+        <w:t xml:space="preserve">19.1.a Activation Threshold: </w:t>
+      </w:r>
+      <w:r>
+        <w:rPr>
+          <w:sz w:val="22"/>
+        </w:rPr>
+        <w:t xml:space="preserve">This Constitution is activated upon: (1) certification by the interim Electoral Commission that the National Voting System is operational and meets the properties of §16.3; and (2) a national ratification vote conducted through the National Voting System achieving 60% affirmative support with at least 50% participation.</w:t>
+      </w:r>
+    </w:p>
+    <w:p>
+      <w:pPr>
+        <w:spacing w:before="60" w:after="60" w:line="280" w:lineRule="auto"/>
+        <w:jc w:val="both"/>
+      </w:pPr>
+      <w:r>
+        <w:rPr>
+          <w:b/>
+          <w:sz w:val="22"/>
+          <w:color w:val="1B2A4A"/>
+        </w:rPr>
+        <w:t xml:space="preserve">19.1.b Institutional Accommodation: </w:t>
+      </w:r>
+      <w:r>
+        <w:rPr>
+          <w:sz w:val="22"/>
+        </w:rPr>
+        <w:t xml:space="preserve">Where a ratifying polity maintains existing legal or administrative institutions whose functions partially overlap with constitutional mechanisms, the Legislature shall by statute within two years of Phase 4 activation define the relationship between such institutions and the constitutional framework. Such statutes must preserve constitutional supremacy and the Supreme Court's jurisdiction over all constitutional questions. This provision recognises that the Republic is ratified into polities with histories, legal traditions, and existing institutional relationships — including relationships with peoples and communities whose governance structures predate the ratifying state — and that those inheritances require constitutional specification, not constitutional silence. If the Legislature fails to enact the required institutional accommodation statute within two years of Phase 4 activation, existing institutions and governance arrangements are deemed constitutionally recognised in their current form pending statutory definition. Default recognition preserves institutional structure and authority; it does not authorise any practice that violates Article I. Existing institutions are recognised as structures; practices within them that violate Article I remain unconstitutional regardless of default recognition status. Accommodation statutes enacted under this provision must not reduce the legal standing of governance structures and institutional relationships that predate the ratifying state below their standing under the law in effect immediately prior to Phase 4 activation. This non-diminishment standard applies to all institutional accommodations including relationships with peoples and communities whose governance structures predate the ratifying state. Statutes enacted under this provision defining the relationship between existing institutions and the constitutional framework may be amended only by a 2/3 majority of both chambers. This elevated threshold applies to any amendment that reduces the protections or standing of existing institutional arrangements.</w:t>
+      </w:r>
+    </w:p>
+    <w:p>
+      <w:pPr>
+        <w:spacing w:before="60" w:after="60" w:line="280" w:lineRule="auto"/>
+        <w:jc w:val="both"/>
+      </w:pPr>
+      <w:r>
+        <w:rPr>
+          <w:b/>
+          <w:sz w:val="22"/>
+          <w:color w:val="1B2A4A"/>
+        </w:rPr>
+        <w:t xml:space="preserve">19.1.c Multi-Founder Formation: </w:t>
+      </w:r>
+      <w:r>
+        <w:rPr>
+          <w:sz w:val="22"/>
+        </w:rPr>
+        <w:t xml:space="preserve">Where the Republic is constituted by two or more sovereign nations simultaneously pooling sovereignty through a treaty of union, the transition provisions of this Article apply with the following adaptations: Phase 0 and Phase 1 certification covers all founding sovereigns simultaneously; debt assumption under §19.6 is consolidated across all founding sovereigns' fiscal histories on terms specified in the treaty of union; the Day Zero NRS publication includes the complete governmental records of all founding sovereigns; and each founding sovereign's predecessor government obligations are assumed by the Republic proportionally as the treaty of union specifies. the Legislature must by statute within two years of Phase 4 activation establish the specific procedures for multi-founder constitutional establishment, covering consolidated debt certification, simultaneous Statehood Audit initiation, and the relationship between the treaty of union and the constitutional text where they address the same matter.</w:t>
       </w:r>
     </w:p>
     <w:p>
@@ -13934,7 +13923,7 @@
           <w:sz w:val="22"/>
           <w:szCs w:val="22"/>
         </w:rPr>
-        <w:t xml:space="preserve">The transition is structured as an 24-month, four-phase process to prevent systemic shock and provide adequate time for institutional construction.</w:t>
+        <w:t>The transition is structured as a 24-month, four-phase process to prevent systemic shock and provide adequate time for institutional construction.</w:t>
       </w:r>
     </w:p>
     <w:p>
@@ -14502,32 +14491,6 @@
     </w:p>
     <w:p>
       <w:pPr>
-        <w:spacing w:after="60" w:before="60" w:line="280" w:lineRule="auto"/>
-        <w:jc w:val="both"/>
-      </w:pPr>
-      <w:r>
-        <w:rPr>
-          <w:rFonts w:ascii="Times New Roman" w:cs="Times New Roman" w:eastAsia="Times New Roman" w:hAnsi="Times New Roman"/>
-          <w:b/>
-          <w:bCs/>
-          <w:color w:val="1B2A4A"/>
-          <w:sz w:val="22"/>
-          <w:szCs w:val="22"/>
-        </w:rPr>
-        <w:t xml:space="preserve">19.7.e Joint Inspectorate Panel Role: </w:t>
-      </w:r>
-      <w:r>
-        <w:rPr>
-          <w:rFonts w:ascii="Times New Roman" w:cs="Times New Roman" w:eastAsia="Times New Roman" w:hAnsi="Times New Roman"/>
-          <w:color w:val="000000"/>
-          <w:sz w:val="22"/>
-          <w:szCs w:val="22"/>
-        </w:rPr>
-        <w:t xml:space="preserve">The joint Inspectorate panel is the receiving body for all Transition-Period territorial elections and subdivision elections under this section. It verifies that submitted resolutions meet the constitutional requirements, coordinates Statehood Audit scheduling with the Legislative Inspectorate, and maintains the official registry of each state's transition status — State, Territory-by-election, Territory-by-audit, or Subdivision-in-progress — on the National Record System throughout the Transition Window. The panel publishes a complete transition status map updated monthly during Phase 2.</w:t>
-      </w:r>
-    </w:p>
-    <w:p>
-      <w:pPr>
         <w:pBdr>
           <w:bottom w:val="single" w:color="7A7060" w:sz="2" w:space="4"/>
         </w:pBdr>
@@ -14568,7 +14531,7 @@
           <w:sz w:val="22"/>
           <w:szCs w:val="22"/>
         </w:rPr>
-        <w:t xml:space="preserve">During Phase 2, the joint Inspectorate panel assembles an initial Candidate Register for the Monetary Authority board members and the Record System Authority Director. No Candidate Register is required for the Monetary Authority Director, who is elected by national Ranked Choice Voting under §10.4.a. the Legislature may by statute designate additional constitutionally independent bodies requiring a Candidate Register, to which the provisions of this section apply. For each candidate, the panel receives a candidate disclosure record submitted by or on behalf of the candidate — including professional background, relevant expertise, financial disclosures, and any prior government positions held. The panel reviews the submitted record for factual accuracy, applies the constitutional eligibility criteria, and publishes the record together with its recommendation to the National Record System, applying the same standards the Executive Inspectorate applies to subsequent reviews. The panel may draw on candidates with experience in prior government fiscal or technical institutions where those institutions were not assessed as having participated in the conduct requiring reform; on international expertise from recognized fiscal, monetary, or technical bodies where domestic expertise is unavailable or compromised; and on citizens residing abroad whose expertise is domestic expertise for this purpose. The panel must publish its assessment of available expertise sources to the National Record System before constituting any Register.</w:t>
+        <w:t>During Phase 2, the joint Inspectorate panel assembles an initial Candidate Register for the Monetary Authority board members and the Record System Authority Director. No Candidate Register is required for the Monetary Authority Director, who is elected by national Ranked Choice Voting under §10.4.a. the Legislature may by statute designate additional constitutionally independent bodies requiring a Candidate Register, to which the provisions of this section apply. For each candidate, the panel receives a candidate disclosure record submitted by or on behalf of the candidate — including professional background, relevant expertise, financial disclosures, and any prior government positions held. The panel reviews the submitted record for factual accuracy, applies the constitutional eligibility criteria, and publishes the record together with its recommendation to the National Record System, applying the same standards the Executive Inspectorate applies to subsequent reviews.</w:t>
       </w:r>
     </w:p>
     <w:p>

</xml_diff>